<commit_message>
Finalize teacher reference bias paper study
</commit_message>
<xml_diff>
--- a/studies/teacher_reference_bias_paper/experiments/isaid_plane/reports/full_metrics/human/isaid_plane_human_full_metric_document_colored.docx
+++ b/studies/teacher_reference_bias_paper/experiments/isaid_plane/reports/full_metrics/human/isaid_plane_human_full_metric_document_colored.docx
@@ -8,7 +8,7 @@
         <w:jc w:val="center"/>
       </w:pPr>
       <w:r>
-        <w:t>Isaid Plane - İnsan referansı Full Metric Document</w:t>
+        <w:t>iSAID Plane - İnsan referansı Full Metric Document</w:t>
       </w:r>
     </w:p>
     <w:p>
@@ -43,6 +43,19 @@
           <w:sz w:val="18"/>
         </w:rPr>
         <w:t>Test kümesi 512 görüntüdür. Dört Overlap × Mask Area grubunun her birinde tam 128 görüntü vardır.</w:t>
+      </w:r>
+    </w:p>
+    <w:p>
+      <w:pPr>
+        <w:pStyle w:val="ListBullet"/>
+        <w:spacing w:after="40"/>
+      </w:pPr>
+      <w:r>
+        <w:rPr>
+          <w:rFonts w:ascii="DejaVu Sans" w:hAnsi="DejaVu Sans"/>
+          <w:sz w:val="18"/>
+        </w:rPr>
+        <w:t>Bu 512 görüntünün tamamında en az bir hedef instance vardır. Detector tablosu bu nedenle resmi, hedef-negatif görüntüler de içeren benchmark AP'si değil pozitif test alt kümesindeki deney içi kontroldür.</w:t>
       </w:r>
     </w:p>
     <w:p>
@@ -391,6 +404,32 @@
           <w:rFonts w:ascii="DejaVu Sans" w:hAnsi="DejaVu Sans"/>
           <w:sz w:val="18"/>
         </w:rPr>
+        <w:t>Detector testi, her birinde en az bir hedef nesne bulunan seçilmiş 512 görüntüden oluşur. Hedef-negatif görüntü içermediği için bu değerler resmi veri seti benchmark AP'si değil deney içi detector kontrolüdür.</w:t>
+      </w:r>
+    </w:p>
+    <w:p>
+      <w:pPr>
+        <w:pStyle w:val="ListBullet"/>
+        <w:spacing w:after="40"/>
+      </w:pPr>
+      <w:r>
+        <w:rPr>
+          <w:rFonts w:ascii="DejaVu Sans" w:hAnsi="DejaVu Sans"/>
+          <w:sz w:val="18"/>
+        </w:rPr>
+        <w:t>Her detector yalnız tek hedef sınıf için eğitilip değerlendirildiğinden, sınıflar üzerindeki ortalama olan mAP bu deneyde o tek sınıfın AP değerine eşittir.</w:t>
+      </w:r>
+    </w:p>
+    <w:p>
+      <w:pPr>
+        <w:pStyle w:val="ListBullet"/>
+        <w:spacing w:after="40"/>
+      </w:pPr>
+      <w:r>
+        <w:rPr>
+          <w:rFonts w:ascii="DejaVu Sans" w:hAnsi="DejaVu Sans"/>
+          <w:sz w:val="18"/>
+        </w:rPr>
         <w:t>BBox mAP50/mAP75/mAP90, tahmin kutusunun GT kutuyla sırasıyla en az 0,50/0,75/0,90 IoU yaptığı eşiklerde confidence sıralaması boyunca hesaplanan gerçek average precision değeridir.</w:t>
       </w:r>
     </w:p>
@@ -7751,7 +7790,7 @@
           <w:rFonts w:ascii="DejaVu Sans" w:hAnsi="DejaVu Sans"/>
           <w:sz w:val="18"/>
         </w:rPr>
-        <w:t>GT bbox ile YOLO bbox arasındaki fark, segmenterden önceki detection hatasının uçtan uca sisteme etkisini gösterir.</w:t>
+        <w:t>GT bbox ile YOLO bbox arasındaki fark, eşleşen veya kaçırılan GT instance'lar üzerindeki lokalizasyon/recall etkisini gösterir. Eşleşmeyen detector yanlış pozitifleri maske ortalamasına eklenmediği için bu fark tam uçtan uca instance-segmentation performansı değildir.</w:t>
       </w:r>
     </w:p>
     <w:p>

</xml_diff>